<commit_message>
Rebuild formatted email signature
</commit_message>
<xml_diff>
--- a/profile_private/Mineo_Raffaele_EmailSignature.docx
+++ b/profile_private/Mineo_Raffaele_EmailSignature.docx
@@ -4,13 +4,7 @@
   <w:body>
     <w:p>
       <w:pPr>
-        <w:spacing w:after="0"/>
-      </w:pPr>
-      <w:r/>
-    </w:p>
-    <w:p>
-      <w:pPr>
-        <w:spacing w:after="0" w:line="240" w:lineRule="auto"/>
+        <w:spacing w:before="120" w:after="120" w:line="240" w:lineRule="auto"/>
       </w:pPr>
       <w:r>
         <w:rPr>
@@ -24,13 +18,7 @@
     </w:p>
     <w:p>
       <w:pPr>
-        <w:spacing w:after="0"/>
-      </w:pPr>
-      <w:r/>
-    </w:p>
-    <w:p>
-      <w:pPr>
-        <w:spacing w:after="0" w:line="240" w:lineRule="auto"/>
+        <w:spacing w:before="0" w:after="0" w:line="240" w:lineRule="auto"/>
       </w:pPr>
       <w:r>
         <w:rPr>
@@ -62,7 +50,7 @@
     </w:p>
     <w:p>
       <w:pPr>
-        <w:spacing w:after="0" w:line="240" w:lineRule="auto"/>
+        <w:spacing w:before="0" w:after="0" w:line="240" w:lineRule="auto"/>
       </w:pPr>
       <w:r>
         <w:rPr>
@@ -85,7 +73,7 @@
     </w:p>
     <w:p>
       <w:pPr>
-        <w:spacing w:after="0" w:line="240" w:lineRule="auto"/>
+        <w:spacing w:before="0" w:after="0" w:line="240" w:lineRule="auto"/>
       </w:pPr>
       <w:r>
         <w:rPr>
@@ -117,7 +105,7 @@
     </w:p>
     <w:p>
       <w:pPr>
-        <w:spacing w:after="0" w:line="240" w:lineRule="auto"/>
+        <w:spacing w:before="0" w:after="0" w:line="240" w:lineRule="auto"/>
       </w:pPr>
       <w:r>
         <w:rPr>
@@ -131,7 +119,7 @@
     </w:p>
     <w:p>
       <w:pPr>
-        <w:spacing w:after="120" w:line="240" w:lineRule="auto"/>
+        <w:spacing w:before="0" w:after="120" w:line="240" w:lineRule="auto"/>
       </w:pPr>
       <w:r>
         <w:rPr>
@@ -145,7 +133,7 @@
     </w:p>
     <w:p>
       <w:pPr>
-        <w:spacing w:after="0" w:line="240" w:lineRule="auto"/>
+        <w:spacing w:before="0" w:after="0" w:line="240" w:lineRule="auto"/>
       </w:pPr>
       <w:r>
         <w:rPr>
@@ -177,7 +165,7 @@
     </w:p>
     <w:p>
       <w:pPr>
-        <w:spacing w:after="0" w:line="240" w:lineRule="auto"/>
+        <w:spacing w:before="0" w:after="0" w:line="240" w:lineRule="auto"/>
       </w:pPr>
       <w:r>
         <w:rPr>
@@ -209,7 +197,7 @@
     </w:p>
     <w:p>
       <w:pPr>
-        <w:spacing w:after="0" w:line="240" w:lineRule="auto"/>
+        <w:spacing w:before="0" w:after="0" w:line="240" w:lineRule="auto"/>
       </w:pPr>
       <w:r>
         <w:rPr>
@@ -241,7 +229,7 @@
     </w:p>
     <w:p>
       <w:pPr>
-        <w:spacing w:after="120" w:line="240" w:lineRule="auto"/>
+        <w:spacing w:before="0" w:after="120" w:line="240" w:lineRule="auto"/>
       </w:pPr>
       <w:r>
         <w:rPr>
@@ -273,7 +261,7 @@
     </w:p>
     <w:p>
       <w:pPr>
-        <w:spacing w:after="0" w:line="240" w:lineRule="auto"/>
+        <w:spacing w:before="0" w:after="0" w:line="240" w:lineRule="auto"/>
       </w:pPr>
       <w:r>
         <w:rPr>

</xml_diff>

<commit_message>
Rebuild full and short email signatures
</commit_message>
<xml_diff>
--- a/profile_private/Mineo_Raffaele_EmailSignature.docx
+++ b/profile_private/Mineo_Raffaele_EmailSignature.docx
@@ -4,16 +4,106 @@
   <w:body>
     <w:p>
       <w:pPr>
-        <w:spacing w:before="120" w:after="120" w:line="240" w:lineRule="auto"/>
+        <w:spacing w:before="0" w:after="70" w:line="240" w:lineRule="auto"/>
       </w:pPr>
       <w:r>
         <w:rPr>
-          <w:rFonts w:ascii="Arial" w:hAnsi="Arial"/>
+          <w:rFonts w:ascii="Segoe UI" w:hAnsi="Segoe UI"/>
           <w:b w:val="0"/>
           <w:i w:val="0"/>
-          <w:sz w:val="21"/>
+          <w:color w:val="606060"/>
+          <w:sz w:val="18"/>
+          <w:u w:val="none"/>
         </w:rPr>
-        <w:t>---</w:t>
+        <w:t xml:space="preserve">Dr. </w:t>
+      </w:r>
+      <w:r>
+        <w:rPr>
+          <w:rFonts w:ascii="Segoe UI" w:hAnsi="Segoe UI"/>
+          <w:b/>
+          <w:i w:val="0"/>
+          <w:color w:val="404040"/>
+          <w:sz w:val="20"/>
+          <w:u w:val="none"/>
+        </w:rPr>
+        <w:t>Raffaele Mineo</w:t>
+      </w:r>
+      <w:r>
+        <w:rPr>
+          <w:rFonts w:ascii="Segoe UI" w:hAnsi="Segoe UI"/>
+          <w:b w:val="0"/>
+          <w:i w:val="0"/>
+          <w:color w:val="606060"/>
+          <w:sz w:val="18"/>
+          <w:u w:val="none"/>
+        </w:rPr>
+        <w:t>, Eng. Ph.D.</w:t>
+      </w:r>
+      <w:r>
+        <w:rPr>
+          <w:rFonts w:ascii="Segoe UI" w:hAnsi="Segoe UI"/>
+          <w:b w:val="0"/>
+          <w:i w:val="0"/>
+          <w:color w:val="606060"/>
+          <w:sz w:val="18"/>
+          <w:u w:val="none"/>
+        </w:rPr>
+        <w:br/>
+      </w:r>
+      <w:r>
+        <w:rPr>
+          <w:rFonts w:ascii="Segoe UI" w:hAnsi="Segoe UI"/>
+          <w:b w:val="0"/>
+          <w:i w:val="0"/>
+          <w:color w:val="606060"/>
+          <w:sz w:val="18"/>
+          <w:u w:val="none"/>
+        </w:rPr>
+        <w:t>Italian National PhD in Artificial Intelligence - Health and Life Sciences | Member, IEEE</w:t>
+      </w:r>
+      <w:r>
+        <w:rPr>
+          <w:rFonts w:ascii="Segoe UI" w:hAnsi="Segoe UI"/>
+          <w:b w:val="0"/>
+          <w:i w:val="0"/>
+          <w:color w:val="606060"/>
+          <w:sz w:val="18"/>
+          <w:u w:val="none"/>
+        </w:rPr>
+        <w:br/>
+      </w:r>
+      <w:r>
+        <w:rPr>
+          <w:rFonts w:ascii="Segoe UI" w:hAnsi="Segoe UI"/>
+          <w:b w:val="0"/>
+          <w:i w:val="0"/>
+          <w:color w:val="606060"/>
+          <w:sz w:val="18"/>
+          <w:u w:val="none"/>
+        </w:rPr>
+        <w:t>Research Fellow - PeRCeiVe.AI Lab | University of Catania</w:t>
+      </w:r>
+      <w:r>
+        <w:rPr>
+          <w:rFonts w:ascii="Segoe UI" w:hAnsi="Segoe UI"/>
+          <w:b w:val="0"/>
+          <w:i w:val="0"/>
+          <w:color w:val="606060"/>
+          <w:sz w:val="18"/>
+          <w:u w:val="none"/>
+        </w:rPr>
+        <w:br/>
+      </w:r>
+      <w:r>
+        <w:rPr>
+          <w:rFonts w:ascii="Segoe UI" w:hAnsi="Segoe UI"/>
+          <w:b w:val="0"/>
+          <w:i w:val="0"/>
+          <w:color w:val="606060"/>
+          <w:sz w:val="18"/>
+          <w:u w:val="none"/>
+        </w:rPr>
+        <w:t>Department of Industrial, Electrical, Electronic and Computer Engineering (DIEEI)</w:t>
       </w:r>
     </w:p>
     <w:p>
@@ -22,30 +112,80 @@
       </w:pPr>
       <w:r>
         <w:rPr>
-          <w:rFonts w:ascii="Arial" w:hAnsi="Arial"/>
+          <w:rFonts w:ascii="Segoe UI" w:hAnsi="Segoe UI"/>
           <w:b w:val="0"/>
           <w:i w:val="0"/>
-          <w:sz w:val="21"/>
+          <w:color w:val="606060"/>
+          <w:sz w:val="18"/>
+          <w:u w:val="none"/>
         </w:rPr>
-        <w:t xml:space="preserve">Dr. </w:t>
+        <w:t>Organizing Committee - IEEE ISBI 2027, Associate to Technical Program Chairs</w:t>
       </w:r>
       <w:r>
         <w:rPr>
-          <w:rFonts w:ascii="Arial" w:hAnsi="Arial"/>
-          <w:b/>
+          <w:rFonts w:ascii="Segoe UI" w:hAnsi="Segoe UI"/>
+          <w:b w:val="0"/>
           <w:i w:val="0"/>
-          <w:sz w:val="21"/>
+          <w:color w:val="606060"/>
+          <w:sz w:val="18"/>
+          <w:u w:val="none"/>
         </w:rPr>
-        <w:t>Raffaele Mineo</w:t>
+        <w:br/>
       </w:r>
       <w:r>
         <w:rPr>
-          <w:rFonts w:ascii="Arial" w:hAnsi="Arial"/>
+          <w:rFonts w:ascii="Segoe UI" w:hAnsi="Segoe UI"/>
           <w:b w:val="0"/>
           <w:i w:val="0"/>
-          <w:sz w:val="21"/>
+          <w:color w:val="606060"/>
+          <w:sz w:val="18"/>
+          <w:u w:val="none"/>
         </w:rPr>
-        <w:t>, Eng. Ph.D.</w:t>
+        <w:t>Associate Editor - Frontiers in Communication</w:t>
+      </w:r>
+      <w:r>
+        <w:rPr>
+          <w:rFonts w:ascii="Segoe UI" w:hAnsi="Segoe UI"/>
+          <w:b w:val="0"/>
+          <w:i w:val="0"/>
+          <w:color w:val="606060"/>
+          <w:sz w:val="18"/>
+          <w:u w:val="none"/>
+        </w:rPr>
+        <w:br/>
+      </w:r>
+      <w:r>
+        <w:rPr>
+          <w:rFonts w:ascii="Segoe UI" w:hAnsi="Segoe UI"/>
+          <w:b w:val="0"/>
+          <w:i w:val="0"/>
+          <w:color w:val="606060"/>
+          <w:sz w:val="18"/>
+          <w:u w:val="none"/>
+        </w:rPr>
+        <w:t>Lead Guest Editor - Springer Cognitive Computation</w:t>
+      </w:r>
+      <w:r>
+        <w:rPr>
+          <w:rFonts w:ascii="Segoe UI" w:hAnsi="Segoe UI"/>
+          <w:b w:val="0"/>
+          <w:i w:val="0"/>
+          <w:color w:val="606060"/>
+          <w:sz w:val="18"/>
+          <w:u w:val="none"/>
+        </w:rPr>
+        <w:br/>
+      </w:r>
+      <w:r>
+        <w:rPr>
+          <w:rFonts w:ascii="Segoe UI" w:hAnsi="Segoe UI"/>
+          <w:b w:val="0"/>
+          <w:i w:val="0"/>
+          <w:color w:val="606060"/>
+          <w:sz w:val="18"/>
+          <w:u w:val="none"/>
+        </w:rPr>
+        <w:t>Area Chair - MICCAI - IEEE ICASSP - IJCNN - IEEE FG</w:t>
       </w:r>
     </w:p>
     <w:p>
@@ -54,385 +194,74 @@
       </w:pPr>
       <w:r>
         <w:rPr>
-          <w:rFonts w:ascii="Arial" w:hAnsi="Arial"/>
+          <w:rFonts w:ascii="Segoe UI" w:hAnsi="Segoe UI"/>
           <w:b w:val="0"/>
-          <w:i/>
-          <w:sz w:val="21"/>
+          <w:i w:val="0"/>
+          <w:color w:val="606060"/>
+          <w:sz w:val="18"/>
+          <w:u w:val="none"/>
         </w:rPr>
-        <w:t>Italian National PhD in Artificial Intelligence - Health and Life Sciences</w:t>
-      </w:r>
-    </w:p>
-    <w:p>
-      <w:pPr>
-        <w:spacing w:before="0" w:after="0" w:line="240" w:lineRule="auto"/>
-      </w:pPr>
-      <w:r>
-        <w:rPr>
-          <w:rFonts w:ascii="Arial" w:hAnsi="Arial"/>
-          <w:b w:val="0"/>
-          <w:i/>
-          <w:sz w:val="21"/>
-        </w:rPr>
-        <w:t>Member</w:t>
+        <w:t>Polo Tecnologico, Via Santa Sofia 102, 95123 Catania, Italy</w:t>
       </w:r>
       <w:r>
         <w:rPr>
-          <w:rFonts w:ascii="Arial" w:hAnsi="Arial"/>
+          <w:rFonts w:ascii="Segoe UI" w:hAnsi="Segoe UI"/>
           <w:b w:val="0"/>
           <w:i w:val="0"/>
-          <w:sz w:val="21"/>
+          <w:color w:val="606060"/>
+          <w:sz w:val="18"/>
+          <w:u w:val="none"/>
         </w:rPr>
-        <w:t>, IEEE</w:t>
-      </w:r>
-    </w:p>
-    <w:p>
-      <w:pPr>
-        <w:spacing w:before="0" w:after="0" w:line="240" w:lineRule="auto"/>
-      </w:pPr>
-      <w:r>
-        <w:rPr>
-          <w:rFonts w:ascii="Arial" w:hAnsi="Arial"/>
-          <w:b w:val="0"/>
-          <w:i/>
-          <w:sz w:val="21"/>
-        </w:rPr>
-        <w:t>Research Fellow</w:t>
+        <w:br/>
       </w:r>
       <w:r>
         <w:rPr>
-          <w:rFonts w:ascii="Arial" w:hAnsi="Arial"/>
+          <w:rFonts w:ascii="Segoe UI" w:hAnsi="Segoe UI"/>
           <w:b w:val="0"/>
           <w:i w:val="0"/>
-          <w:sz w:val="21"/>
+          <w:color w:val="606060"/>
+          <w:sz w:val="18"/>
+          <w:u w:val="none"/>
         </w:rPr>
-        <w:t xml:space="preserve">, </w:t>
-      </w:r>
-      <w:r>
-        <w:rPr>
-          <w:rFonts w:ascii="Arial" w:hAnsi="Arial"/>
-          <w:b/>
-          <w:i w:val="0"/>
-          <w:sz w:val="21"/>
-        </w:rPr>
-        <w:t>PeRCeiVe.Ai Lab</w:t>
-      </w:r>
-    </w:p>
-    <w:p>
-      <w:pPr>
-        <w:spacing w:before="0" w:after="0" w:line="240" w:lineRule="auto"/>
-      </w:pPr>
-      <w:r>
-        <w:rPr>
-          <w:rFonts w:ascii="Arial" w:hAnsi="Arial"/>
-          <w:b w:val="0"/>
-          <w:i w:val="0"/>
-          <w:sz w:val="21"/>
-        </w:rPr>
-        <w:t>Department of Industrial, Electrical, Electronic and Computer Engineering (DIEEI)</w:t>
-      </w:r>
-    </w:p>
-    <w:p>
-      <w:pPr>
-        <w:spacing w:before="0" w:after="120" w:line="240" w:lineRule="auto"/>
-      </w:pPr>
-      <w:r>
-        <w:rPr>
-          <w:rFonts w:ascii="Arial" w:hAnsi="Arial"/>
-          <w:b w:val="0"/>
-          <w:i w:val="0"/>
-          <w:sz w:val="21"/>
-        </w:rPr>
-        <w:t>University of Catania, Catania, Italy</w:t>
-      </w:r>
-    </w:p>
-    <w:p>
-      <w:pPr>
-        <w:spacing w:before="0" w:after="0" w:line="240" w:lineRule="auto"/>
-      </w:pPr>
-      <w:r>
-        <w:rPr>
-          <w:rFonts w:ascii="Arial" w:hAnsi="Arial"/>
-          <w:b/>
-          <w:i w:val="0"/>
-          <w:sz w:val="21"/>
-        </w:rPr>
-        <w:t>Organizing Committee</w:t>
-      </w:r>
-      <w:r>
-        <w:rPr>
-          <w:rFonts w:ascii="Arial" w:hAnsi="Arial"/>
-          <w:b w:val="0"/>
-          <w:i w:val="0"/>
-          <w:sz w:val="21"/>
-        </w:rPr>
-        <w:t xml:space="preserve"> - </w:t>
-      </w:r>
-      <w:r>
-        <w:rPr>
-          <w:rFonts w:ascii="Arial" w:hAnsi="Arial"/>
-          <w:b w:val="0"/>
-          <w:i/>
-          <w:sz w:val="21"/>
-        </w:rPr>
-        <w:t>IEEE International Symposium on Biomedical Imaging (ISBI 2027)</w:t>
-      </w:r>
-      <w:r>
-        <w:rPr>
-          <w:rFonts w:ascii="Arial" w:hAnsi="Arial"/>
-          <w:b w:val="0"/>
-          <w:i w:val="0"/>
-          <w:sz w:val="21"/>
-        </w:rPr>
-        <w:t>, Associate to Technical Program Chairs</w:t>
-      </w:r>
-    </w:p>
-    <w:p>
-      <w:pPr>
-        <w:spacing w:before="0" w:after="0" w:line="240" w:lineRule="auto"/>
-      </w:pPr>
-      <w:r>
-        <w:rPr>
-          <w:rFonts w:ascii="Arial" w:hAnsi="Arial"/>
-          <w:b/>
-          <w:i w:val="0"/>
-          <w:sz w:val="21"/>
-        </w:rPr>
-        <w:t>Associate Editor</w:t>
-      </w:r>
-      <w:r>
-        <w:rPr>
-          <w:rFonts w:ascii="Arial" w:hAnsi="Arial"/>
-          <w:b w:val="0"/>
-          <w:i w:val="0"/>
-          <w:sz w:val="21"/>
-        </w:rPr>
-        <w:t xml:space="preserve">, </w:t>
-      </w:r>
-      <w:r>
-        <w:rPr>
-          <w:rFonts w:ascii="Arial" w:hAnsi="Arial"/>
-          <w:b w:val="0"/>
-          <w:i/>
-          <w:sz w:val="21"/>
-        </w:rPr>
-        <w:t>Frontiers in Communication</w:t>
-      </w:r>
-    </w:p>
-    <w:p>
-      <w:pPr>
-        <w:spacing w:before="0" w:after="0" w:line="240" w:lineRule="auto"/>
-      </w:pPr>
-      <w:r>
-        <w:rPr>
-          <w:rFonts w:ascii="Arial" w:hAnsi="Arial"/>
-          <w:b/>
-          <w:i w:val="0"/>
-          <w:sz w:val="21"/>
-        </w:rPr>
-        <w:t>Lead Guest Editor</w:t>
-      </w:r>
-      <w:r>
-        <w:rPr>
-          <w:rFonts w:ascii="Arial" w:hAnsi="Arial"/>
-          <w:b w:val="0"/>
-          <w:i w:val="0"/>
-          <w:sz w:val="21"/>
-        </w:rPr>
-        <w:t xml:space="preserve">, </w:t>
-      </w:r>
-      <w:r>
-        <w:rPr>
-          <w:rFonts w:ascii="Arial" w:hAnsi="Arial"/>
-          <w:b w:val="0"/>
-          <w:i/>
-          <w:sz w:val="21"/>
-        </w:rPr>
-        <w:t>Springer Cognitive Computation</w:t>
-      </w:r>
-    </w:p>
-    <w:p>
-      <w:pPr>
-        <w:spacing w:before="0" w:after="0" w:line="240" w:lineRule="auto"/>
-      </w:pPr>
-      <w:r>
-        <w:rPr>
-          <w:rFonts w:ascii="Arial" w:hAnsi="Arial"/>
-          <w:b/>
-          <w:i w:val="0"/>
-          <w:sz w:val="21"/>
-        </w:rPr>
-        <w:t>Area Chair</w:t>
-      </w:r>
-      <w:r>
-        <w:rPr>
-          <w:rFonts w:ascii="Arial" w:hAnsi="Arial"/>
-          <w:b w:val="0"/>
-          <w:i w:val="0"/>
-          <w:sz w:val="21"/>
-        </w:rPr>
-        <w:t xml:space="preserve">, </w:t>
-      </w:r>
-      <w:r>
-        <w:rPr>
-          <w:rFonts w:ascii="Arial" w:hAnsi="Arial"/>
-          <w:b w:val="0"/>
-          <w:i/>
-          <w:sz w:val="21"/>
-        </w:rPr>
-        <w:t>Medical Image Computing and Computer-Assisted Intervention (MICCAI)</w:t>
-      </w:r>
-    </w:p>
-    <w:p>
-      <w:pPr>
-        <w:spacing w:before="0" w:after="0" w:line="240" w:lineRule="auto"/>
-      </w:pPr>
-      <w:r>
-        <w:rPr>
-          <w:rFonts w:ascii="Arial" w:hAnsi="Arial"/>
-          <w:b/>
-          <w:i w:val="0"/>
-          <w:sz w:val="21"/>
-        </w:rPr>
-        <w:t>Area Chair</w:t>
-      </w:r>
-      <w:r>
-        <w:rPr>
-          <w:rFonts w:ascii="Arial" w:hAnsi="Arial"/>
-          <w:b w:val="0"/>
-          <w:i w:val="0"/>
-          <w:sz w:val="21"/>
-        </w:rPr>
-        <w:t xml:space="preserve">, </w:t>
-      </w:r>
-      <w:r>
-        <w:rPr>
-          <w:rFonts w:ascii="Arial" w:hAnsi="Arial"/>
-          <w:b w:val="0"/>
-          <w:i/>
-          <w:sz w:val="21"/>
-        </w:rPr>
-        <w:t>IEEE International Conference on Acoustics, Speech, and Signal Processing (ICASSP)</w:t>
-      </w:r>
-    </w:p>
-    <w:p>
-      <w:pPr>
-        <w:spacing w:before="0" w:after="0" w:line="240" w:lineRule="auto"/>
-      </w:pPr>
-      <w:r>
-        <w:rPr>
-          <w:rFonts w:ascii="Arial" w:hAnsi="Arial"/>
-          <w:b/>
-          <w:i w:val="0"/>
-          <w:sz w:val="21"/>
-        </w:rPr>
-        <w:t>Area Chair</w:t>
-      </w:r>
-      <w:r>
-        <w:rPr>
-          <w:rFonts w:ascii="Arial" w:hAnsi="Arial"/>
-          <w:b w:val="0"/>
-          <w:i w:val="0"/>
-          <w:sz w:val="21"/>
-        </w:rPr>
-        <w:t xml:space="preserve">, </w:t>
-      </w:r>
-      <w:r>
-        <w:rPr>
-          <w:rFonts w:ascii="Arial" w:hAnsi="Arial"/>
-          <w:b w:val="0"/>
-          <w:i/>
-          <w:sz w:val="21"/>
-        </w:rPr>
-        <w:t>International Joint Conference on Neural Networks (IJCNN)</w:t>
-      </w:r>
-    </w:p>
-    <w:p>
-      <w:pPr>
-        <w:spacing w:before="0" w:after="120" w:line="240" w:lineRule="auto"/>
-      </w:pPr>
-      <w:r>
-        <w:rPr>
-          <w:rFonts w:ascii="Arial" w:hAnsi="Arial"/>
-          <w:b/>
-          <w:i w:val="0"/>
-          <w:sz w:val="21"/>
-        </w:rPr>
-        <w:t>Area Chair</w:t>
-      </w:r>
-      <w:r>
-        <w:rPr>
-          <w:rFonts w:ascii="Arial" w:hAnsi="Arial"/>
-          <w:b w:val="0"/>
-          <w:i w:val="0"/>
-          <w:sz w:val="21"/>
-        </w:rPr>
-        <w:t xml:space="preserve">, </w:t>
-      </w:r>
-      <w:r>
-        <w:rPr>
-          <w:rFonts w:ascii="Arial" w:hAnsi="Arial"/>
-          <w:b w:val="0"/>
-          <w:i/>
-          <w:sz w:val="21"/>
-        </w:rPr>
-        <w:t>IEEE International Conference on Automatic Face and Gesture Recognition (FG)</w:t>
-      </w:r>
-    </w:p>
-    <w:p>
-      <w:pPr>
-        <w:spacing w:before="0" w:after="0" w:line="240" w:lineRule="auto"/>
-      </w:pPr>
-      <w:r>
-        <w:rPr>
-          <w:rFonts w:ascii="Arial" w:hAnsi="Arial"/>
-          <w:b w:val="0"/>
-          <w:i w:val="0"/>
-          <w:sz w:val="21"/>
-        </w:rPr>
-        <w:t>Polo Tecnologico, Via Santa Sofia 102, 95123 Catania, Italy</w:t>
-      </w:r>
-    </w:p>
-    <w:p>
-      <w:pPr>
-        <w:spacing w:after="120"/>
-      </w:pPr>
-      <w:r>
-        <w:t xml:space="preserve">Web: </w:t>
+        <w:t xml:space="preserve">Email: </w:t>
       </w:r>
       <w:hyperlink r:id="rId9">
         <w:r>
           <w:rPr>
-            <w:color w:val="0563C1"/>
-            <w:u w:val="single"/>
+            <w:rFonts w:ascii="Segoe UI" w:hAnsi="Segoe UI" w:eastAsia="Segoe UI" w:cs="Segoe UI"/>
+            <w:color w:val="365F7D"/>
+            <w:sz w:val="18"/>
+            <w:u w:val="none"/>
           </w:rPr>
-          <w:t>https://IngRaffaeleMineo.GitHub.io/</w:t>
+          <w:t>raffaele.mineo@phd.unict.it</w:t>
+        </w:r>
+      </w:hyperlink>
+      <w:r>
+        <w:rPr>
+          <w:rFonts w:ascii="Segoe UI" w:hAnsi="Segoe UI"/>
+          <w:b w:val="0"/>
+          <w:i w:val="0"/>
+          <w:color w:val="606060"/>
+          <w:sz w:val="18"/>
+          <w:u w:val="none"/>
+        </w:rPr>
+        <w:t xml:space="preserve"> | Web: </w:t>
+      </w:r>
+      <w:hyperlink r:id="rId10">
+        <w:r>
+          <w:rPr>
+            <w:rFonts w:ascii="Segoe UI" w:hAnsi="Segoe UI" w:eastAsia="Segoe UI" w:cs="Segoe UI"/>
+            <w:color w:val="365F7D"/>
+            <w:sz w:val="18"/>
+            <w:u w:val="none"/>
+          </w:rPr>
+          <w:t>ingraffaelemineo.github.io</w:t>
         </w:r>
       </w:hyperlink>
     </w:p>
-    <w:p>
-      <w:pPr>
-        <w:spacing w:after="0"/>
-      </w:pPr>
-      <w:r>
-        <w:rPr>
-          <w:rFonts w:ascii="Arial" w:hAnsi="Arial"/>
-          <w:i/>
-          <w:sz w:val="21"/>
-        </w:rPr>
-        <w:t>My Life is The Research, and I am truly lucky to be able to live it to the fullest</w:t>
-      </w:r>
-      <w:r>
-        <w:rPr>
-          <w:rFonts w:ascii="Segoe UI Emoji" w:hAnsi="Segoe UI Emoji"/>
-          <w:i w:val="0"/>
-          <w:sz w:val="21"/>
-        </w:rPr>
-        <w:t xml:space="preserve"> 🙃</w:t>
-      </w:r>
-    </w:p>
     <w:sectPr>
       <w:pgSz w:w="12240" w:h="15840"/>
-      <w:pgMar w:top="648" w:right="792" w:bottom="648" w:left="792" w:header="720" w:footer="720" w:gutter="0"/>
+      <w:pgMar w:top="461" w:right="634" w:bottom="461" w:left="634" w:header="720" w:footer="720" w:gutter="0"/>
       <w:cols w:space="720"/>
       <w:docGrid w:linePitch="360"/>
     </w:sectPr>
@@ -804,11 +633,15 @@
     <w:qFormat/>
     <w:rsid w:val="00FC693F"/>
     <w:pPr>
-      <w:spacing w:after="0" w:line="240" w:lineRule="auto"/>
+      <w:spacing w:before="0" w:after="0" w:line="240" w:lineRule="auto"/>
     </w:pPr>
     <w:rPr>
-      <w:rFonts w:ascii="Arial" w:hAnsi="Arial"/>
-      <w:sz w:val="21"/>
+      <w:rFonts w:ascii="Segoe UI" w:hAnsi="Segoe UI"/>
+      <w:b w:val="0"/>
+      <w:i w:val="0"/>
+      <w:color w:val="606060"/>
+      <w:sz w:val="18"/>
+      <w:u w:val="none"/>
     </w:rPr>
   </w:style>
   <w:style w:type="paragraph" w:styleId="Header">

</xml_diff>